<commit_message>
content: rebadge as Lakshay Sharma (GF202216641) under Dr. Kritika Rana
- Replace student name + registration number + capstone mentor across
  README, SPEC, /pitch slides, /report HTML, Layout footer, docx generator.
- generate_report_docx.py: insert real Word page breaks before every
  section heading (Acknowledgement, Abstract, ToC, LoF, LoT, each chapter,
  Questions, References) so the rendered .docx mirrors the template's
  per-section pagination regardless of body length, and switch Q&A answer
  paragraphs to the Normal style so they read distinctly from the
  list-paragraph questions.
- Regenerate web/public/Pratidhwani-Capstone-Report.docx (90,707 bytes,
  19 explicit page breaks, 261 paragraphs total).
</commit_message>
<xml_diff>
--- a/web/public/Pratidhwani-Capstone-Report.docx
+++ b/web/public/Pratidhwani-Capstone-Report.docx
@@ -128,7 +128,7 @@
         <w:rPr>
           <w:b/>
         </w:rPr>
-        <w:t>Name of Student: Anshuman Mohanty</w:t>
+        <w:t>Name of Student: Lakshay Sharma</w:t>
       </w:r>
     </w:p>
     <w:p>
@@ -147,7 +147,7 @@
           <w:noProof/>
           <w:lang w:val="en-US"/>
         </w:rPr>
-        <w:t>Registration Number: GF202217744</w:t>
+        <w:t>Registration Number: GF202216641</w:t>
       </w:r>
     </w:p>
     <w:p>
@@ -192,7 +192,7 @@
         <w:rPr>
           <w:b/>
         </w:rPr>
-        <w:t>Capstone Mentor: Mr. Ashish</w:t>
+        <w:t>Capstone Mentor: Dr. Kritika Rana</w:t>
       </w:r>
     </w:p>
     <w:tbl>
@@ -495,6 +495,7 @@
         </w:rPr>
       </w:pPr>
       <w:r>
+        <w:br w:type="page"/>
         <w:rPr>
           <w:rFonts w:ascii="Times New Roman" w:hAnsi="Times New Roman" w:cs="Times New Roman"/>
           <w:b/>
@@ -512,7 +513,7 @@
       </w:pPr>
       <w:r/>
       <w:r>
-        <w:t>I express my sincere gratitude to my Capstone Mentor, Mr. Ashish, of the Yogananda School of AI, Computers and Data Sciences, Shoolini University of Biotechnology and Management Sciences, Solan, H.P., for his patient guidance, constructive criticism, and steady encouragement throughout this capstone. His insistence on rigour at every step shaped the way I framed the research gaps and the way I designed Pratidhwani end-to-end on Google Cloud Run.</w:t>
+        <w:t>I express my sincere gratitude to my Capstone Mentor, Dr. Kritika Rana, of the Yogananda School of AI, Computers and Data Sciences, Shoolini University of Biotechnology and Management Sciences, Solan, H.P., for his patient guidance, constructive criticism, and steady encouragement throughout this capstone. His insistence on rigour at every step shaped the way I framed the research gaps and the way I designed Pratidhwani end-to-end on Google Cloud Run.</w:t>
       </w:r>
     </w:p>
     <w:p>
@@ -833,6 +834,7 @@
         </w:rPr>
       </w:pPr>
       <w:r>
+        <w:br w:type="page"/>
         <w:rPr>
           <w:rFonts w:ascii="Times New Roman" w:hAnsi="Times New Roman" w:cs="Times New Roman"/>
           <w:b/>
@@ -1227,6 +1229,7 @@
         </w:rPr>
       </w:pPr>
       <w:r>
+        <w:br w:type="page"/>
         <w:rPr>
           <w:rFonts w:ascii="Times New Roman" w:hAnsi="Times New Roman" w:cs="Times New Roman"/>
           <w:b/>
@@ -1600,6 +1603,7 @@
         </w:rPr>
       </w:pPr>
       <w:r>
+        <w:br w:type="page"/>
         <w:rPr>
           <w:rFonts w:ascii="Times New Roman" w:hAnsi="Times New Roman" w:cs="Times New Roman"/>
           <w:b/>
@@ -1995,6 +1999,7 @@
         </w:rPr>
       </w:pPr>
       <w:r>
+        <w:br w:type="page"/>
         <w:rPr>
           <w:rFonts w:ascii="Times New Roman" w:hAnsi="Times New Roman" w:cs="Times New Roman"/>
           <w:b/>
@@ -2047,6 +2052,7 @@
         </w:rPr>
       </w:pPr>
       <w:r>
+        <w:br w:type="page"/>
         <w:rPr>
           <w:rFonts w:ascii="Times New Roman" w:hAnsi="Times New Roman" w:cs="Times New Roman"/>
           <w:b/>
@@ -2178,6 +2184,7 @@
         </w:rPr>
       </w:pPr>
       <w:r>
+        <w:br w:type="page"/>
         <w:rPr>
           <w:rFonts w:ascii="Times New Roman" w:hAnsi="Times New Roman" w:cs="Times New Roman"/>
           <w:b/>
@@ -2240,6 +2247,7 @@
         </w:rPr>
       </w:pPr>
       <w:r>
+        <w:br w:type="page"/>
         <w:rPr>
           <w:rFonts w:ascii="Times New Roman" w:hAnsi="Times New Roman" w:cs="Times New Roman"/>
           <w:b/>
@@ -2301,6 +2309,7 @@
         </w:rPr>
       </w:pPr>
       <w:r>
+        <w:br w:type="page"/>
         <w:rPr>
           <w:rFonts w:ascii="Times New Roman" w:hAnsi="Times New Roman" w:cs="Times New Roman"/>
           <w:b/>
@@ -2362,6 +2371,7 @@
         </w:rPr>
       </w:pPr>
       <w:r>
+        <w:br w:type="page"/>
         <w:rPr>
           <w:rFonts w:ascii="Times New Roman" w:hAnsi="Times New Roman" w:cs="Times New Roman"/>
           <w:b/>
@@ -2423,6 +2433,7 @@
         </w:rPr>
       </w:pPr>
       <w:r>
+        <w:br w:type="page"/>
         <w:rPr>
           <w:rFonts w:ascii="Times New Roman" w:hAnsi="Times New Roman" w:cs="Times New Roman"/>
           <w:b/>
@@ -2484,6 +2495,7 @@
         </w:rPr>
       </w:pPr>
       <w:r>
+        <w:br w:type="page"/>
         <w:rPr>
           <w:rFonts w:ascii="Times New Roman" w:hAnsi="Times New Roman" w:cs="Times New Roman"/>
           <w:b/>
@@ -2545,6 +2557,7 @@
         </w:rPr>
       </w:pPr>
       <w:r>
+        <w:br w:type="page"/>
         <w:rPr>
           <w:rFonts w:ascii="Times New Roman" w:hAnsi="Times New Roman" w:cs="Times New Roman"/>
           <w:b/>
@@ -2606,6 +2619,7 @@
         </w:rPr>
       </w:pPr>
       <w:r>
+        <w:br w:type="page"/>
         <w:rPr>
           <w:rFonts w:ascii="Times New Roman" w:hAnsi="Times New Roman" w:cs="Times New Roman"/>
           <w:b/>
@@ -2667,6 +2681,7 @@
         </w:rPr>
       </w:pPr>
       <w:r>
+        <w:br w:type="page"/>
         <w:rPr>
           <w:rFonts w:ascii="Times New Roman" w:hAnsi="Times New Roman" w:cs="Times New Roman"/>
           <w:b/>
@@ -2746,6 +2761,7 @@
         </w:rPr>
       </w:pPr>
       <w:r>
+        <w:br w:type="page"/>
         <w:rPr>
           <w:rFonts w:ascii="Times New Roman" w:hAnsi="Times New Roman" w:cs="Times New Roman"/>
           <w:b/>
@@ -2798,6 +2814,7 @@
         </w:rPr>
       </w:pPr>
       <w:r>
+        <w:br w:type="page"/>
         <w:rPr>
           <w:rFonts w:ascii="Times New Roman" w:hAnsi="Times New Roman" w:cs="Times New Roman"/>
           <w:b/>
@@ -3354,6 +3371,7 @@
         </w:rPr>
       </w:pPr>
       <w:r>
+        <w:br w:type="page"/>
         <w:rPr>
           <w:rFonts w:ascii="Times New Roman" w:hAnsi="Times New Roman" w:cs="Times New Roman"/>
           <w:b/>

</xml_diff>